<commit_message>
Update ICD and AI-optimized markdown files to v1.4.8
Change-Id: If51d1cef834fe735111f39e8ae8989ba283bf13f
</commit_message>
<xml_diff>
--- a/Documentation/SEDAP-Express ICD v1.4.8.docx
+++ b/Documentation/SEDAP-Express ICD v1.4.8.docx
@@ -19066,7 +19066,61 @@
           <w:szCs w:val="22"/>
           <w:lang w:val="en-US"/>
         </w:rPr>
-        <w:t>EMISSION;5E;0195238E15AD;66A3;R;;;100;;53.32;8.11;0;;;;20;8725000.0#8735000.0;20000;3;0;2;6;10233;;</w:t>
+        <w:t>EMISSION;5E;0195238E15AD;66A3;R;;;100;;53.32;8.11;0;;;;20;8725000.0#8735000.0;20000;3;0</w:t>
+      </w:r>
+      <w:r>
+        <w:rPr>
+          <w:rFonts w:ascii="Roboto" w:hAnsi="Roboto" w:cs="Segoe UI"/>
+          <w:sz w:val="22"/>
+          <w:szCs w:val="22"/>
+          <w:lang w:val="en-US"/>
+        </w:rPr>
+        <w:t>0</w:t>
+      </w:r>
+      <w:r>
+        <w:rPr>
+          <w:rFonts w:ascii="Roboto" w:hAnsi="Roboto" w:cs="Segoe UI"/>
+          <w:sz w:val="22"/>
+          <w:szCs w:val="22"/>
+          <w:lang w:val="en-US"/>
+        </w:rPr>
+        <w:t>;</w:t>
+      </w:r>
+      <w:r>
+        <w:rPr>
+          <w:rFonts w:ascii="Roboto" w:hAnsi="Roboto" w:cs="Segoe UI"/>
+          <w:sz w:val="22"/>
+          <w:szCs w:val="22"/>
+          <w:lang w:val="en-US"/>
+        </w:rPr>
+        <w:t>0</w:t>
+      </w:r>
+      <w:r>
+        <w:rPr>
+          <w:rFonts w:ascii="Roboto" w:hAnsi="Roboto" w:cs="Segoe UI"/>
+          <w:sz w:val="22"/>
+          <w:szCs w:val="22"/>
+          <w:lang w:val="en-US"/>
+        </w:rPr>
+        <w:t>2;</w:t>
+      </w:r>
+      <w:r>
+        <w:rPr>
+          <w:rFonts w:ascii="Roboto" w:hAnsi="Roboto" w:cs="Segoe UI"/>
+          <w:sz w:val="22"/>
+          <w:szCs w:val="22"/>
+          <w:lang w:val="en-US"/>
+        </w:rPr>
+        <w:t>0</w:t>
+      </w:r>
+      <w:r>
+        <w:rPr>
+          <w:rFonts w:ascii="Roboto" w:hAnsi="Roboto" w:cs="Segoe UI"/>
+          <w:sz w:val="22"/>
+          <w:szCs w:val="22"/>
+          <w:lang w:val="en-US"/>
+        </w:rPr>
+        <w:t>6;10233;;</w:t>
       </w:r>
       <w:r>
         <w:rPr>
@@ -19107,7 +19161,61 @@
           <w:szCs w:val="22"/>
           <w:lang w:val="en-US"/>
         </w:rPr>
-        <w:t>EMISSION;5F;0195238E25AD;66A3;R;;;101;;54.86;9.32;0;52.12;9.8;50;233;25725.0;4000;1;5;2;0;;sngpesr--------</w:t>
+        <w:t>EMISSION;5F;0195238E25AD;66A3;R;;;101;;54.86;9.32;0;52.12;9.8;50;233;25725.0;4000;1;</w:t>
+      </w:r>
+      <w:r>
+        <w:rPr>
+          <w:rFonts w:ascii="Roboto" w:hAnsi="Roboto" w:cs="Segoe UI"/>
+          <w:sz w:val="22"/>
+          <w:szCs w:val="22"/>
+          <w:lang w:val="en-US"/>
+        </w:rPr>
+        <w:t>0</w:t>
+      </w:r>
+      <w:r>
+        <w:rPr>
+          <w:rFonts w:ascii="Roboto" w:hAnsi="Roboto" w:cs="Segoe UI"/>
+          <w:sz w:val="22"/>
+          <w:szCs w:val="22"/>
+          <w:lang w:val="en-US"/>
+        </w:rPr>
+        <w:t>5;</w:t>
+      </w:r>
+      <w:r>
+        <w:rPr>
+          <w:rFonts w:ascii="Roboto" w:hAnsi="Roboto" w:cs="Segoe UI"/>
+          <w:sz w:val="22"/>
+          <w:szCs w:val="22"/>
+          <w:lang w:val="en-US"/>
+        </w:rPr>
+        <w:t>0</w:t>
+      </w:r>
+      <w:r>
+        <w:rPr>
+          <w:rFonts w:ascii="Roboto" w:hAnsi="Roboto" w:cs="Segoe UI"/>
+          <w:sz w:val="22"/>
+          <w:szCs w:val="22"/>
+          <w:lang w:val="en-US"/>
+        </w:rPr>
+        <w:t>2;</w:t>
+      </w:r>
+      <w:r>
+        <w:rPr>
+          <w:rFonts w:ascii="Roboto" w:hAnsi="Roboto" w:cs="Segoe UI"/>
+          <w:sz w:val="22"/>
+          <w:szCs w:val="22"/>
+          <w:lang w:val="en-US"/>
+        </w:rPr>
+        <w:t>0</w:t>
+      </w:r>
+      <w:r>
+        <w:rPr>
+          <w:rFonts w:ascii="Roboto" w:hAnsi="Roboto" w:cs="Segoe UI"/>
+          <w:sz w:val="22"/>
+          <w:szCs w:val="22"/>
+          <w:lang w:val="en-US"/>
+        </w:rPr>
+        <w:t>0;;sngpesr--------</w:t>
       </w:r>
       <w:r>
         <w:rPr>
@@ -34471,7 +34579,25 @@
           <w:szCs w:val="22"/>
           <w:lang w:val="en-US"/>
         </w:rPr>
-        <w:t xml:space="preserve">But of course its </w:t>
+        <w:t>But of course it</w:t>
+      </w:r>
+      <w:r>
+        <w:rPr>
+          <w:rFonts w:ascii="Roboto" w:hAnsi="Roboto" w:cs="Segoe UI"/>
+          <w:sz w:val="22"/>
+          <w:szCs w:val="22"/>
+          <w:lang w:val="en-US"/>
+        </w:rPr>
+        <w:t>’</w:t>
+      </w:r>
+      <w:r>
+        <w:rPr>
+          <w:rFonts w:ascii="Roboto" w:hAnsi="Roboto" w:cs="Segoe UI"/>
+          <w:sz w:val="22"/>
+          <w:szCs w:val="22"/>
+          <w:lang w:val="en-US"/>
+        </w:rPr>
+        <w:t xml:space="preserve">s </w:t>
       </w:r>
       <w:r>
         <w:rPr>
@@ -37482,7 +37608,25 @@
           <w:szCs w:val="22"/>
           <w:lang w:val="en-US"/>
         </w:rPr>
-        <w:t>u1#50;;443D;1;MTAuMC4wLjEzMg==;;RnVsbHkgb3BlcmF0aW9uYWw=</w:t>
+        <w:t>u1#50;;443D;</w:t>
+      </w:r>
+      <w:r>
+        <w:rPr>
+          <w:rFonts w:ascii="Roboto" w:hAnsi="Roboto" w:cs="Segoe UI"/>
+          <w:sz w:val="22"/>
+          <w:szCs w:val="22"/>
+          <w:lang w:val="en-US"/>
+        </w:rPr>
+        <w:t>0</w:t>
+      </w:r>
+      <w:r>
+        <w:rPr>
+          <w:rFonts w:ascii="Roboto" w:hAnsi="Roboto" w:cs="Segoe UI"/>
+          <w:sz w:val="22"/>
+          <w:szCs w:val="22"/>
+          <w:lang w:val="en-US"/>
+        </w:rPr>
+        <w:t>1;MTAuMC4wLjEzMg==;;RnVsbHkgb3BlcmF0aW9uYWw=</w:t>
       </w:r>
     </w:p>
     <w:p>
@@ -37535,7 +37679,25 @@
           <w:szCs w:val="22"/>
           <w:lang w:val="en-US"/>
         </w:rPr>
-        <w:t>STATUS;16;0195238E25AD;129E;R;;;2;2;BMG#10;;;;ED32;3;;aHR0cDovLzEwLjAuMC4xL2ltYWdlLnBuZw==;T3V0IG9mIGZ1ZWwh</w:t>
+        <w:t>STATUS;16;0195238E25AD;129E;R;;;2;2;BMG#10;;;;ED32;</w:t>
+      </w:r>
+      <w:r>
+        <w:rPr>
+          <w:rFonts w:ascii="Roboto" w:hAnsi="Roboto" w:cs="Segoe UI"/>
+          <w:sz w:val="22"/>
+          <w:szCs w:val="22"/>
+          <w:lang w:val="en-US"/>
+        </w:rPr>
+        <w:t>0</w:t>
+      </w:r>
+      <w:r>
+        <w:rPr>
+          <w:rFonts w:ascii="Roboto" w:hAnsi="Roboto" w:cs="Segoe UI"/>
+          <w:sz w:val="22"/>
+          <w:szCs w:val="22"/>
+          <w:lang w:val="en-US"/>
+        </w:rPr>
+        <w:t>3;;aHR0cDovLzEwLjAuMC4xL2ltYWdlLnBuZw==;T3V0IG9mIGZ1ZWwh</w:t>
       </w:r>
     </w:p>
     <w:p>
@@ -41960,7 +42122,7 @@
           <v:shape id="_x0000_i1025" type="#_x0000_t75" style="width:376.3pt;height:228.85pt" o:ole="">
             <v:imagedata r:id="rId11" o:title=""/>
           </v:shape>
-          <o:OLEObject Type="Embed" ProgID="Visio.Drawing.15" ShapeID="_x0000_i1025" DrawAspect="Content" ObjectID="_1850503267" r:id="rId12"/>
+          <o:OLEObject Type="Embed" ProgID="Visio.Drawing.15" ShapeID="_x0000_i1025" DrawAspect="Content" ObjectID="_1850505277" r:id="rId12"/>
         </w:object>
       </w:r>
     </w:p>
@@ -45128,7 +45290,7 @@
           <v:shape id="_x0000_i1026" type="#_x0000_t75" style="width:608.15pt;height:417pt" o:ole="">
             <v:imagedata r:id="rId14" o:title=""/>
           </v:shape>
-          <o:OLEObject Type="Embed" ProgID="Visio.Drawing.15" ShapeID="_x0000_i1026" DrawAspect="Content" ObjectID="_1850503268" r:id="rId15"/>
+          <o:OLEObject Type="Embed" ProgID="Visio.Drawing.15" ShapeID="_x0000_i1026" DrawAspect="Content" ObjectID="_1850505278" r:id="rId15"/>
         </w:object>
       </w:r>
     </w:p>

</xml_diff>